<commit_message>
Knowledge - 2-Science - fix sources - part 2 - 11/8/2025
</commit_message>
<xml_diff>
--- a/Knowledge/2-Science/3-Social science/1-Linguistics/0-Intro to Linguistics/5-My Source/3-Chomsky's Three Models of Language.docx
+++ b/Knowledge/2-Science/3-Social science/1-Linguistics/0-Intro to Linguistics/5-My Source/3-Chomsky's Three Models of Language.docx
@@ -38,12 +38,21 @@
         </w:rPr>
         <w:t xml:space="preserve">: </w:t>
       </w:r>
-      <w:r>
-        <w:rPr>
-          <w:b/>
-          <w:shd w:val="clear" w:color="auto" w:fill="B7B7B7"/>
-        </w:rPr>
-        <w:t xml:space="preserve">Chatgpt </w:t>
+      <w:proofErr w:type="spellStart"/>
+      <w:r>
+        <w:rPr>
+          <w:b/>
+          <w:shd w:val="clear" w:color="auto" w:fill="B7B7B7"/>
+        </w:rPr>
+        <w:t>Chatgpt</w:t>
+      </w:r>
+      <w:proofErr w:type="spellEnd"/>
+      <w:r>
+        <w:rPr>
+          <w:b/>
+          <w:shd w:val="clear" w:color="auto" w:fill="B7B7B7"/>
+        </w:rPr>
+        <w:t xml:space="preserve"> </w:t>
       </w:r>
       <w:r>
         <w:rPr>
@@ -52,7 +61,7 @@
           <w:szCs w:val="14"/>
           <w:shd w:val="clear" w:color="auto" w:fill="B7B7B7"/>
         </w:rPr>
-        <w:t>(GPT-5-Standard) at [10/2</w:t>
+        <w:t>(</w:t>
       </w:r>
       <w:r>
         <w:rPr>
@@ -61,16 +70,35 @@
           <w:szCs w:val="14"/>
           <w:shd w:val="clear" w:color="auto" w:fill="B7B7B7"/>
         </w:rPr>
-        <w:t>3</w:t>
-      </w:r>
-      <w:r>
-        <w:rPr>
+        <w:t>GPT</w:t>
+      </w:r>
+      <w:r>
+        <w:rPr>
+          <w:rFonts w:ascii="Cambria Math" w:hAnsi="Cambria Math" w:cs="Cambria Math"/>
           <w:b/>
           <w:sz w:val="14"/>
           <w:szCs w:val="14"/>
           <w:shd w:val="clear" w:color="auto" w:fill="B7B7B7"/>
         </w:rPr>
-        <w:t>/2025]</w:t>
+        <w:t>‑</w:t>
+      </w:r>
+      <w:r>
+        <w:rPr>
+          <w:b/>
+          <w:sz w:val="14"/>
+          <w:szCs w:val="14"/>
+          <w:shd w:val="clear" w:color="auto" w:fill="B7B7B7"/>
+        </w:rPr>
+        <w:t>5 Mini</w:t>
+      </w:r>
+      <w:r>
+        <w:rPr>
+          <w:b/>
+          <w:sz w:val="14"/>
+          <w:szCs w:val="14"/>
+          <w:shd w:val="clear" w:color="auto" w:fill="B7B7B7"/>
+        </w:rPr>
+        <w:t>) at [10/23/2025]</w:t>
       </w:r>
     </w:p>
     <w:p>
@@ -286,7 +314,7 @@
           <w:rFonts w:ascii="Roboto Mono" w:hAnsi="Roboto Mono"/>
         </w:rPr>
         <w:pict w14:anchorId="02E881E7">
-          <v:rect id="_x0000_i1169" style="width:0;height:1.5pt" o:hralign="center" o:hrstd="t" o:hr="t" fillcolor="#a0a0a0" stroked="f"/>
+          <v:rect id="_x0000_i1025" style="width:0;height:1.5pt" o:hralign="center" o:hrstd="t" o:hr="t" fillcolor="#a0a0a0" stroked="f"/>
         </w:pict>
       </w:r>
     </w:p>
@@ -562,7 +590,7 @@
           <w:rFonts w:ascii="Roboto Mono" w:hAnsi="Roboto Mono"/>
         </w:rPr>
         <w:pict w14:anchorId="2CCC1C6A">
-          <v:rect id="_x0000_i1170" style="width:0;height:1.5pt" o:hralign="center" o:hrstd="t" o:hr="t" fillcolor="#a0a0a0" stroked="f"/>
+          <v:rect id="_x0000_i1026" style="width:0;height:1.5pt" o:hralign="center" o:hrstd="t" o:hr="t" fillcolor="#a0a0a0" stroked="f"/>
         </w:pict>
       </w:r>
     </w:p>
@@ -643,7 +671,7 @@
           <w:rFonts w:ascii="Roboto Mono" w:hAnsi="Roboto Mono"/>
         </w:rPr>
         <w:pict w14:anchorId="2D6AC968">
-          <v:rect id="_x0000_i1171" style="width:0;height:1.5pt" o:hralign="center" o:hrstd="t" o:hr="t" fillcolor="#a0a0a0" stroked="f"/>
+          <v:rect id="_x0000_i1027" style="width:0;height:1.5pt" o:hralign="center" o:hrstd="t" o:hr="t" fillcolor="#a0a0a0" stroked="f"/>
         </w:pict>
       </w:r>
     </w:p>
@@ -738,7 +766,7 @@
           <w:rFonts w:ascii="Roboto Mono" w:hAnsi="Roboto Mono"/>
         </w:rPr>
         <w:pict w14:anchorId="74BD5C6A">
-          <v:rect id="_x0000_i1172" style="width:0;height:1.5pt" o:hralign="center" o:hrstd="t" o:hr="t" fillcolor="#a0a0a0" stroked="f"/>
+          <v:rect id="_x0000_i1028" style="width:0;height:1.5pt" o:hralign="center" o:hrstd="t" o:hr="t" fillcolor="#a0a0a0" stroked="f"/>
         </w:pict>
       </w:r>
     </w:p>
@@ -767,12 +795,21 @@
         </w:rPr>
         <w:t xml:space="preserve">: </w:t>
       </w:r>
-      <w:r>
-        <w:rPr>
-          <w:b/>
-          <w:shd w:val="clear" w:color="auto" w:fill="B7B7B7"/>
-        </w:rPr>
-        <w:t xml:space="preserve">Chatgpt </w:t>
+      <w:proofErr w:type="spellStart"/>
+      <w:r>
+        <w:rPr>
+          <w:b/>
+          <w:shd w:val="clear" w:color="auto" w:fill="B7B7B7"/>
+        </w:rPr>
+        <w:t>Chatgpt</w:t>
+      </w:r>
+      <w:proofErr w:type="spellEnd"/>
+      <w:r>
+        <w:rPr>
+          <w:b/>
+          <w:shd w:val="clear" w:color="auto" w:fill="B7B7B7"/>
+        </w:rPr>
+        <w:t xml:space="preserve"> </w:t>
       </w:r>
       <w:r>
         <w:rPr>
@@ -781,91 +818,7 @@
           <w:szCs w:val="14"/>
           <w:shd w:val="clear" w:color="auto" w:fill="B7B7B7"/>
         </w:rPr>
-        <w:t>(GPT-5-Standard) at [10/23/2025]</w:t>
-      </w:r>
-    </w:p>
-    <w:p>
-      <w:pPr>
-        <w:rPr>
-          <w:rFonts w:ascii="Roboto Mono" w:hAnsi="Roboto Mono"/>
-        </w:rPr>
-      </w:pPr>
-      <w:r>
-        <w:rPr>
-          <w:rFonts w:ascii="Roboto Mono" w:hAnsi="Roboto Mono"/>
-        </w:rPr>
-        <w:t xml:space="preserve">Let’s break down </w:t>
-      </w:r>
-      <w:r>
-        <w:rPr>
-          <w:rFonts w:ascii="Roboto Mono" w:hAnsi="Roboto Mono"/>
-          <w:b/>
-          <w:bCs/>
-        </w:rPr>
-        <w:t>Chomsky’s three key models of language</w:t>
-      </w:r>
-      <w:r>
-        <w:rPr>
-          <w:rFonts w:ascii="Roboto Mono" w:hAnsi="Roboto Mono"/>
-        </w:rPr>
-        <w:t xml:space="preserve"> carefully and clearly. These are foundational concepts in modern linguistics.</w:t>
-      </w:r>
-    </w:p>
-    <w:p>
-      <w:pPr>
-        <w:rPr>
-          <w:rFonts w:ascii="Roboto Mono" w:hAnsi="Roboto Mono"/>
-        </w:rPr>
-      </w:pPr>
-      <w:r>
-        <w:rPr>
-          <w:rFonts w:ascii="Roboto Mono" w:hAnsi="Roboto Mono"/>
-        </w:rPr>
-        <w:pict w14:anchorId="7D575B1D">
-          <v:rect id="_x0000_i1267" style="width:0;height:1.5pt" o:hralign="center" o:hrstd="t" o:hr="t" fillcolor="#a0a0a0" stroked="f"/>
-        </w:pict>
-      </w:r>
-    </w:p>
-    <w:p>
-      <w:pPr>
-        <w:pStyle w:val="Heading3"/>
-      </w:pPr>
-      <w:r>
-        <w:t>1️</w:t>
-      </w:r>
-      <w:r>
-        <w:rPr>
-          <w:rFonts w:ascii="Segoe UI Symbol" w:hAnsi="Segoe UI Symbol" w:cs="Segoe UI Symbol"/>
-        </w:rPr>
-        <w:t>⃣</w:t>
-      </w:r>
-      <w:r>
-        <w:t xml:space="preserve"> Linguistic Competence</w:t>
-      </w:r>
-    </w:p>
-    <w:p>
-      <w:pPr>
-        <w:spacing w:before="240" w:after="240"/>
-      </w:pPr>
-      <w:r>
-        <w:rPr>
-          <w:b/>
-          <w:shd w:val="clear" w:color="auto" w:fill="B7B7B7"/>
-        </w:rPr>
-        <w:t># Source</w:t>
-      </w:r>
-      <w:r>
-        <w:rPr>
-          <w:shd w:val="clear" w:color="auto" w:fill="B7B7B7"/>
-        </w:rPr>
-        <w:t xml:space="preserve">: </w:t>
-      </w:r>
-      <w:r>
-        <w:rPr>
-          <w:b/>
-          <w:shd w:val="clear" w:color="auto" w:fill="B7B7B7"/>
-        </w:rPr>
-        <w:t xml:space="preserve">Chatgpt </w:t>
+        <w:t>(</w:t>
       </w:r>
       <w:r>
         <w:rPr>
@@ -874,7 +827,174 @@
           <w:szCs w:val="14"/>
           <w:shd w:val="clear" w:color="auto" w:fill="B7B7B7"/>
         </w:rPr>
-        <w:t>(GPT-5-Standard) at [10/23/2025]</w:t>
+        <w:t>GPT</w:t>
+      </w:r>
+      <w:r>
+        <w:rPr>
+          <w:rFonts w:ascii="Cambria Math" w:hAnsi="Cambria Math" w:cs="Cambria Math"/>
+          <w:b/>
+          <w:sz w:val="14"/>
+          <w:szCs w:val="14"/>
+          <w:shd w:val="clear" w:color="auto" w:fill="B7B7B7"/>
+        </w:rPr>
+        <w:t>‑</w:t>
+      </w:r>
+      <w:r>
+        <w:rPr>
+          <w:b/>
+          <w:sz w:val="14"/>
+          <w:szCs w:val="14"/>
+          <w:shd w:val="clear" w:color="auto" w:fill="B7B7B7"/>
+        </w:rPr>
+        <w:t>5 Mini</w:t>
+      </w:r>
+      <w:r>
+        <w:rPr>
+          <w:b/>
+          <w:sz w:val="14"/>
+          <w:szCs w:val="14"/>
+          <w:shd w:val="clear" w:color="auto" w:fill="B7B7B7"/>
+        </w:rPr>
+        <w:t>) at [10/23/2025]</w:t>
+      </w:r>
+    </w:p>
+    <w:p>
+      <w:pPr>
+        <w:rPr>
+          <w:rFonts w:ascii="Roboto Mono" w:hAnsi="Roboto Mono"/>
+        </w:rPr>
+      </w:pPr>
+      <w:r>
+        <w:rPr>
+          <w:rFonts w:ascii="Roboto Mono" w:hAnsi="Roboto Mono"/>
+        </w:rPr>
+        <w:t xml:space="preserve">Let’s break down </w:t>
+      </w:r>
+      <w:r>
+        <w:rPr>
+          <w:rFonts w:ascii="Roboto Mono" w:hAnsi="Roboto Mono"/>
+          <w:b/>
+          <w:bCs/>
+        </w:rPr>
+        <w:t>Chomsky’s three key models of language</w:t>
+      </w:r>
+      <w:r>
+        <w:rPr>
+          <w:rFonts w:ascii="Roboto Mono" w:hAnsi="Roboto Mono"/>
+        </w:rPr>
+        <w:t xml:space="preserve"> carefully and clearly. These are foundational concepts in modern linguistics.</w:t>
+      </w:r>
+    </w:p>
+    <w:p>
+      <w:pPr>
+        <w:rPr>
+          <w:rFonts w:ascii="Roboto Mono" w:hAnsi="Roboto Mono"/>
+        </w:rPr>
+      </w:pPr>
+      <w:r>
+        <w:rPr>
+          <w:rFonts w:ascii="Roboto Mono" w:hAnsi="Roboto Mono"/>
+        </w:rPr>
+        <w:pict w14:anchorId="7D575B1D">
+          <v:rect id="_x0000_i1029" style="width:0;height:1.5pt" o:hralign="center" o:hrstd="t" o:hr="t" fillcolor="#a0a0a0" stroked="f"/>
+        </w:pict>
+      </w:r>
+    </w:p>
+    <w:p>
+      <w:pPr>
+        <w:pStyle w:val="Heading3"/>
+      </w:pPr>
+      <w:r>
+        <w:t>1️</w:t>
+      </w:r>
+      <w:r>
+        <w:rPr>
+          <w:rFonts w:ascii="Segoe UI Symbol" w:hAnsi="Segoe UI Symbol" w:cs="Segoe UI Symbol"/>
+        </w:rPr>
+        <w:t>⃣</w:t>
+      </w:r>
+      <w:r>
+        <w:t xml:space="preserve"> Linguistic Competence</w:t>
+      </w:r>
+    </w:p>
+    <w:p>
+      <w:pPr>
+        <w:spacing w:before="240" w:after="240"/>
+      </w:pPr>
+      <w:r>
+        <w:rPr>
+          <w:b/>
+          <w:shd w:val="clear" w:color="auto" w:fill="B7B7B7"/>
+        </w:rPr>
+        <w:t># Source</w:t>
+      </w:r>
+      <w:r>
+        <w:rPr>
+          <w:shd w:val="clear" w:color="auto" w:fill="B7B7B7"/>
+        </w:rPr>
+        <w:t xml:space="preserve">: </w:t>
+      </w:r>
+      <w:proofErr w:type="spellStart"/>
+      <w:r>
+        <w:rPr>
+          <w:b/>
+          <w:shd w:val="clear" w:color="auto" w:fill="B7B7B7"/>
+        </w:rPr>
+        <w:t>Chatgpt</w:t>
+      </w:r>
+      <w:proofErr w:type="spellEnd"/>
+      <w:r>
+        <w:rPr>
+          <w:b/>
+          <w:shd w:val="clear" w:color="auto" w:fill="B7B7B7"/>
+        </w:rPr>
+        <w:t xml:space="preserve"> </w:t>
+      </w:r>
+      <w:r>
+        <w:rPr>
+          <w:b/>
+          <w:sz w:val="14"/>
+          <w:szCs w:val="14"/>
+          <w:shd w:val="clear" w:color="auto" w:fill="B7B7B7"/>
+        </w:rPr>
+        <w:t>(</w:t>
+      </w:r>
+      <w:r>
+        <w:rPr>
+          <w:b/>
+          <w:sz w:val="14"/>
+          <w:szCs w:val="14"/>
+          <w:shd w:val="clear" w:color="auto" w:fill="B7B7B7"/>
+        </w:rPr>
+        <w:t>GPT</w:t>
+      </w:r>
+      <w:r>
+        <w:rPr>
+          <w:rFonts w:ascii="Cambria Math" w:hAnsi="Cambria Math" w:cs="Cambria Math"/>
+          <w:b/>
+          <w:sz w:val="14"/>
+          <w:szCs w:val="14"/>
+          <w:shd w:val="clear" w:color="auto" w:fill="B7B7B7"/>
+        </w:rPr>
+        <w:t>‑</w:t>
+      </w:r>
+      <w:r>
+        <w:rPr>
+          <w:b/>
+          <w:sz w:val="14"/>
+          <w:szCs w:val="14"/>
+          <w:shd w:val="clear" w:color="auto" w:fill="B7B7B7"/>
+        </w:rPr>
+        <w:t>5 Mini</w:t>
+      </w:r>
+      <w:r>
+        <w:rPr>
+          <w:b/>
+          <w:sz w:val="14"/>
+          <w:szCs w:val="14"/>
+          <w:shd w:val="clear" w:color="auto" w:fill="B7B7B7"/>
+        </w:rPr>
+        <w:t>) at [10/23/2025]</w:t>
       </w:r>
     </w:p>
     <w:p>
@@ -1088,7 +1208,7 @@
           <w:rFonts w:ascii="Roboto Mono" w:hAnsi="Roboto Mono"/>
         </w:rPr>
         <w:pict w14:anchorId="1B4F6E69">
-          <v:rect id="_x0000_i1268" style="width:0;height:1.5pt" o:hralign="center" o:hrstd="t" o:hr="t" fillcolor="#a0a0a0" stroked="f"/>
+          <v:rect id="_x0000_i1030" style="width:0;height:1.5pt" o:hralign="center" o:hrstd="t" o:hr="t" fillcolor="#a0a0a0" stroked="f"/>
         </w:pict>
       </w:r>
     </w:p>
@@ -1126,12 +1246,21 @@
         </w:rPr>
         <w:t xml:space="preserve">: </w:t>
       </w:r>
-      <w:r>
-        <w:rPr>
-          <w:b/>
-          <w:shd w:val="clear" w:color="auto" w:fill="B7B7B7"/>
-        </w:rPr>
-        <w:t xml:space="preserve">Chatgpt </w:t>
+      <w:proofErr w:type="spellStart"/>
+      <w:r>
+        <w:rPr>
+          <w:b/>
+          <w:shd w:val="clear" w:color="auto" w:fill="B7B7B7"/>
+        </w:rPr>
+        <w:t>Chatgpt</w:t>
+      </w:r>
+      <w:proofErr w:type="spellEnd"/>
+      <w:r>
+        <w:rPr>
+          <w:b/>
+          <w:shd w:val="clear" w:color="auto" w:fill="B7B7B7"/>
+        </w:rPr>
+        <w:t xml:space="preserve"> </w:t>
       </w:r>
       <w:r>
         <w:rPr>
@@ -1140,7 +1269,44 @@
           <w:szCs w:val="14"/>
           <w:shd w:val="clear" w:color="auto" w:fill="B7B7B7"/>
         </w:rPr>
-        <w:t>(GPT-5-Standard) at [10/23/2025]</w:t>
+        <w:t>(</w:t>
+      </w:r>
+      <w:r>
+        <w:rPr>
+          <w:b/>
+          <w:sz w:val="14"/>
+          <w:szCs w:val="14"/>
+          <w:shd w:val="clear" w:color="auto" w:fill="B7B7B7"/>
+        </w:rPr>
+        <w:t>GPT</w:t>
+      </w:r>
+      <w:r>
+        <w:rPr>
+          <w:rFonts w:ascii="Cambria Math" w:hAnsi="Cambria Math" w:cs="Cambria Math"/>
+          <w:b/>
+          <w:sz w:val="14"/>
+          <w:szCs w:val="14"/>
+          <w:shd w:val="clear" w:color="auto" w:fill="B7B7B7"/>
+        </w:rPr>
+        <w:t>‑</w:t>
+      </w:r>
+      <w:r>
+        <w:rPr>
+          <w:b/>
+          <w:sz w:val="14"/>
+          <w:szCs w:val="14"/>
+          <w:shd w:val="clear" w:color="auto" w:fill="B7B7B7"/>
+        </w:rPr>
+        <w:t>5 Mini</w:t>
+      </w:r>
+      <w:r>
+        <w:rPr>
+          <w:b/>
+          <w:sz w:val="14"/>
+          <w:szCs w:val="14"/>
+          <w:shd w:val="clear" w:color="auto" w:fill="B7B7B7"/>
+        </w:rPr>
+        <w:t>) at [10/23/2025]</w:t>
       </w:r>
     </w:p>
     <w:p>
@@ -1367,7 +1533,7 @@
           <w:rFonts w:ascii="Roboto Mono" w:hAnsi="Roboto Mono"/>
         </w:rPr>
         <w:pict w14:anchorId="514B63D2">
-          <v:rect id="_x0000_i1269" style="width:0;height:1.5pt" o:hralign="center" o:hrstd="t" o:hr="t" fillcolor="#a0a0a0" stroked="f"/>
+          <v:rect id="_x0000_i1031" style="width:0;height:1.5pt" o:hralign="center" o:hrstd="t" o:hr="t" fillcolor="#a0a0a0" stroked="f"/>
         </w:pict>
       </w:r>
     </w:p>
@@ -1406,12 +1572,21 @@
         </w:rPr>
         <w:t xml:space="preserve">: </w:t>
       </w:r>
-      <w:r>
-        <w:rPr>
-          <w:b/>
-          <w:shd w:val="clear" w:color="auto" w:fill="B7B7B7"/>
-        </w:rPr>
-        <w:t xml:space="preserve">Chatgpt </w:t>
+      <w:proofErr w:type="spellStart"/>
+      <w:r>
+        <w:rPr>
+          <w:b/>
+          <w:shd w:val="clear" w:color="auto" w:fill="B7B7B7"/>
+        </w:rPr>
+        <w:t>Chatgpt</w:t>
+      </w:r>
+      <w:proofErr w:type="spellEnd"/>
+      <w:r>
+        <w:rPr>
+          <w:b/>
+          <w:shd w:val="clear" w:color="auto" w:fill="B7B7B7"/>
+        </w:rPr>
+        <w:t xml:space="preserve"> </w:t>
       </w:r>
       <w:r>
         <w:rPr>
@@ -1420,7 +1595,44 @@
           <w:szCs w:val="14"/>
           <w:shd w:val="clear" w:color="auto" w:fill="B7B7B7"/>
         </w:rPr>
-        <w:t>(GPT-5-Standard) at [10/23/2025]</w:t>
+        <w:t>(</w:t>
+      </w:r>
+      <w:r>
+        <w:rPr>
+          <w:b/>
+          <w:sz w:val="14"/>
+          <w:szCs w:val="14"/>
+          <w:shd w:val="clear" w:color="auto" w:fill="B7B7B7"/>
+        </w:rPr>
+        <w:t>GPT</w:t>
+      </w:r>
+      <w:r>
+        <w:rPr>
+          <w:rFonts w:ascii="Cambria Math" w:hAnsi="Cambria Math" w:cs="Cambria Math"/>
+          <w:b/>
+          <w:sz w:val="14"/>
+          <w:szCs w:val="14"/>
+          <w:shd w:val="clear" w:color="auto" w:fill="B7B7B7"/>
+        </w:rPr>
+        <w:t>‑</w:t>
+      </w:r>
+      <w:r>
+        <w:rPr>
+          <w:b/>
+          <w:sz w:val="14"/>
+          <w:szCs w:val="14"/>
+          <w:shd w:val="clear" w:color="auto" w:fill="B7B7B7"/>
+        </w:rPr>
+        <w:t>5 Mini</w:t>
+      </w:r>
+      <w:r>
+        <w:rPr>
+          <w:b/>
+          <w:sz w:val="14"/>
+          <w:szCs w:val="14"/>
+          <w:shd w:val="clear" w:color="auto" w:fill="B7B7B7"/>
+        </w:rPr>
+        <w:t>) at [10/23/2025]</w:t>
       </w:r>
     </w:p>
     <w:p>
@@ -1588,7 +1800,7 @@
           <w:rFonts w:ascii="Roboto Mono" w:hAnsi="Roboto Mono"/>
         </w:rPr>
         <w:pict w14:anchorId="54415989">
-          <v:rect id="_x0000_i1270" style="width:0;height:1.5pt" o:hralign="center" o:hrstd="t" o:hr="t" fillcolor="#a0a0a0" stroked="f"/>
+          <v:rect id="_x0000_i1032" style="width:0;height:1.5pt" o:hralign="center" o:hrstd="t" o:hr="t" fillcolor="#a0a0a0" stroked="f"/>
         </w:pict>
       </w:r>
     </w:p>
@@ -1623,12 +1835,21 @@
         </w:rPr>
         <w:t xml:space="preserve">: </w:t>
       </w:r>
-      <w:r>
-        <w:rPr>
-          <w:b/>
-          <w:shd w:val="clear" w:color="auto" w:fill="B7B7B7"/>
-        </w:rPr>
-        <w:t xml:space="preserve">Chatgpt </w:t>
+      <w:proofErr w:type="spellStart"/>
+      <w:r>
+        <w:rPr>
+          <w:b/>
+          <w:shd w:val="clear" w:color="auto" w:fill="B7B7B7"/>
+        </w:rPr>
+        <w:t>Chatgpt</w:t>
+      </w:r>
+      <w:proofErr w:type="spellEnd"/>
+      <w:r>
+        <w:rPr>
+          <w:b/>
+          <w:shd w:val="clear" w:color="auto" w:fill="B7B7B7"/>
+        </w:rPr>
+        <w:t xml:space="preserve"> </w:t>
       </w:r>
       <w:r>
         <w:rPr>
@@ -1637,7 +1858,44 @@
           <w:szCs w:val="14"/>
           <w:shd w:val="clear" w:color="auto" w:fill="B7B7B7"/>
         </w:rPr>
-        <w:t>(GPT-5-Standard) at [10/23/2025]</w:t>
+        <w:t>(</w:t>
+      </w:r>
+      <w:r>
+        <w:rPr>
+          <w:b/>
+          <w:sz w:val="14"/>
+          <w:szCs w:val="14"/>
+          <w:shd w:val="clear" w:color="auto" w:fill="B7B7B7"/>
+        </w:rPr>
+        <w:t>GPT</w:t>
+      </w:r>
+      <w:r>
+        <w:rPr>
+          <w:rFonts w:ascii="Cambria Math" w:hAnsi="Cambria Math" w:cs="Cambria Math"/>
+          <w:b/>
+          <w:sz w:val="14"/>
+          <w:szCs w:val="14"/>
+          <w:shd w:val="clear" w:color="auto" w:fill="B7B7B7"/>
+        </w:rPr>
+        <w:t>‑</w:t>
+      </w:r>
+      <w:r>
+        <w:rPr>
+          <w:b/>
+          <w:sz w:val="14"/>
+          <w:szCs w:val="14"/>
+          <w:shd w:val="clear" w:color="auto" w:fill="B7B7B7"/>
+        </w:rPr>
+        <w:t>5 Mini</w:t>
+      </w:r>
+      <w:r>
+        <w:rPr>
+          <w:b/>
+          <w:sz w:val="14"/>
+          <w:szCs w:val="14"/>
+          <w:shd w:val="clear" w:color="auto" w:fill="B7B7B7"/>
+        </w:rPr>
+        <w:t>) at [10/23/2025]</w:t>
       </w:r>
     </w:p>
     <w:p>
@@ -2005,7 +2263,7 @@
           <w:rFonts w:ascii="Roboto Mono" w:hAnsi="Roboto Mono"/>
         </w:rPr>
         <w:pict w14:anchorId="6A14CC56">
-          <v:rect id="_x0000_i1271" style="width:0;height:1.5pt" o:hralign="center" o:hrstd="t" o:hr="t" fillcolor="#a0a0a0" stroked="f"/>
+          <v:rect id="_x0000_i1033" style="width:0;height:1.5pt" o:hralign="center" o:hrstd="t" o:hr="t" fillcolor="#a0a0a0" stroked="f"/>
         </w:pict>
       </w:r>
     </w:p>
@@ -4126,6 +4384,7 @@
   <w:style w:type="character" w:default="1" w:styleId="DefaultParagraphFont">
     <w:name w:val="Default Paragraph Font"/>
     <w:uiPriority w:val="1"/>
+    <w:semiHidden/>
     <w:unhideWhenUsed/>
   </w:style>
   <w:style w:type="table" w:default="1" w:styleId="TableNormal">

</xml_diff>